<commit_message>
WhiteBoard Update - 2026-04-27 15:56:29
</commit_message>
<xml_diff>
--- a/A2_Kinder/01_FamilieAlltag/01_FamilieErzaehlen/A2_Kinder_FamilieAlltag_01_FamilieErzaehlen_Schreiben.docx
+++ b/A2_Kinder/01_FamilieAlltag/01_FamilieErzaehlen/A2_Kinder_FamilieAlltag_01_FamilieErzaehlen_Schreiben.docx
@@ -167,7 +167,29 @@
           <w:sz w:val="36"/>
           <w:szCs w:val="36"/>
         </w:rPr>
-        <w:t>ber die Familie erzaehlen</w:t>
+        <w:t>ber die Familie erz</w:t>
+      </w:r>
+      <w:r>
+        <w:rPr>
+          <w:rFonts w:eastAsia="Arial" w:cs="Arial" w:ascii="Arial" w:hAnsi="Arial"/>
+          <w:b/>
+          <w:bCs/>
+          <w:color w:val="1F4E79"/>
+          <w:sz w:val="36"/>
+          <w:szCs w:val="36"/>
+        </w:rPr>
+        <w:t>ä</w:t>
+      </w:r>
+      <w:r>
+        <w:rPr>
+          <w:rFonts w:eastAsia="Arial" w:cs="Arial" w:ascii="Arial" w:hAnsi="Arial"/>
+          <w:b/>
+          <w:bCs/>
+          <w:color w:val="1F4E79"/>
+          <w:sz w:val="36"/>
+          <w:szCs w:val="36"/>
+        </w:rPr>
+        <w:t>hlen</w:t>
       </w:r>
     </w:p>
     <w:p>

</xml_diff>